<commit_message>
Actualizar la evidencia de documentación con las cifras medidas de la batería
</commit_message>
<xml_diff>
--- a/FASE 2/Evidencias Proyecto/Evidencias de documentación/Arquitectura Sistema.docx
+++ b/FASE 2/Evidencias Proyecto/Evidencias de documentación/Arquitectura Sistema.docx
@@ -6849,7 +6849,7 @@
           <w:sz w:val="20"/>
           <w:szCs w:val="20"/>
         </w:rPr>
-        <w:t>Validada mediante 269 pruebas automatizadas en Jest con 100% de éxito.</w:t>
+        <w:t>Validada mediante 280 pruebas automatizadas en Jest con 100% de éxito.</w:t>
       </w:r>
     </w:p>
     <w:p>
@@ -6866,7 +6866,7 @@
           <w:sz w:val="20"/>
           <w:szCs w:val="20"/>
         </w:rPr>
-        <w:t xml:space="preserve">• RNF-MANT-03 (Migraciones DDL 001-013): </w:t>
+        <w:t xml:space="preserve">• RNF-MANT-03 (Migraciones DDL 001-015): </w:t>
       </w:r>
       <w:r>
         <w:rPr>
@@ -11942,7 +11942,7 @@
           <w:sz w:val="20"/>
           <w:szCs w:val="20"/>
         </w:rPr>
-        <w:t>La confiabilidad de GesTock está respaldada por una batería automatizada en Jest con 269 pruebas ejecutadas con un 100% de éxito (258 de backend y 11 de frontend, complementadas con 81 verificaciones E2E).</w:t>
+        <w:t>La confiabilidad de GesTock está respaldada por una batería automatizada en Jest con 280 pruebas ejecutadas con un 100% de éxito (269 de backend y 11 de contrato de la interfaz), complementadas con 92 verificaciones de extremo a extremo.</w:t>
       </w:r>
     </w:p>
     <w:tbl>
@@ -13014,7 +13014,7 @@
           <w:sz w:val="20"/>
           <w:szCs w:val="20"/>
         </w:rPr>
-        <w:t>Desarrollo en TypeScript estricto, 269 pruebas automatizadas y arquitectura Cloud-Native con Docker Compose.</w:t>
+        <w:t>Desarrollo en TypeScript estricto, 280 pruebas automatizadas y arquitectura Cloud-Native con Docker Compose.</w:t>
       </w:r>
     </w:p>
     <w:sectPr>

</xml_diff>

<commit_message>
Actualizar la evidencia de documentación con las cifras de la batería ampliada
</commit_message>
<xml_diff>
--- a/FASE 2/Evidencias Proyecto/Evidencias de documentación/Arquitectura Sistema.docx
+++ b/FASE 2/Evidencias Proyecto/Evidencias de documentación/Arquitectura Sistema.docx
@@ -6849,7 +6849,7 @@
           <w:sz w:val="20"/>
           <w:szCs w:val="20"/>
         </w:rPr>
-        <w:t>Validada mediante 280 pruebas automatizadas en Jest con 100% de éxito.</w:t>
+        <w:t>Validada mediante 286 pruebas automatizadas en Jest con 100% de éxito.</w:t>
       </w:r>
     </w:p>
     <w:p>
@@ -11942,7 +11942,7 @@
           <w:sz w:val="20"/>
           <w:szCs w:val="20"/>
         </w:rPr>
-        <w:t>La confiabilidad de GesTock está respaldada por una batería automatizada en Jest con 280 pruebas ejecutadas con un 100% de éxito (269 de backend y 11 de contrato de la interfaz), complementadas con 92 verificaciones de extremo a extremo.</w:t>
+        <w:t>La confiabilidad de GesTock está respaldada por una batería automatizada en Jest con 286 pruebas ejecutadas con un 100% de éxito (275 de backend y 11 de contrato de la interfaz), complementadas con 92 verificaciones de extremo a extremo.</w:t>
       </w:r>
     </w:p>
     <w:tbl>
@@ -13014,7 +13014,7 @@
           <w:sz w:val="20"/>
           <w:szCs w:val="20"/>
         </w:rPr>
-        <w:t>Desarrollo en TypeScript estricto, 280 pruebas automatizadas y arquitectura Cloud-Native con Docker Compose.</w:t>
+        <w:t>Desarrollo en TypeScript estricto, 286 pruebas automatizadas y arquitectura Cloud-Native con Docker Compose.</w:t>
       </w:r>
     </w:p>
     <w:sectPr>

</xml_diff>

<commit_message>
Actualizar la evidencia de documentación con la batería de existencia por lote
</commit_message>
<xml_diff>
--- a/FASE 2/Evidencias Proyecto/Evidencias de documentación/Arquitectura Sistema.docx
+++ b/FASE 2/Evidencias Proyecto/Evidencias de documentación/Arquitectura Sistema.docx
@@ -6849,7 +6849,7 @@
           <w:sz w:val="20"/>
           <w:szCs w:val="20"/>
         </w:rPr>
-        <w:t>Validada mediante 286 pruebas automatizadas en Jest con 100% de éxito.</w:t>
+        <w:t>Validada mediante 298 pruebas automatizadas en Jest con 100% de éxito.</w:t>
       </w:r>
     </w:p>
     <w:p>
@@ -6866,7 +6866,7 @@
           <w:sz w:val="20"/>
           <w:szCs w:val="20"/>
         </w:rPr>
-        <w:t xml:space="preserve">• RNF-MANT-03 (Migraciones DDL 001-015): </w:t>
+        <w:t xml:space="preserve">• RNF-MANT-03 (Migraciones DDL 001-016): </w:t>
       </w:r>
       <w:r>
         <w:rPr>
@@ -7219,7 +7219,7 @@
           <w:sz w:val="20"/>
           <w:szCs w:val="20"/>
         </w:rPr>
-        <w:t xml:space="preserve">El esquema de datos relacional de GesTock está conformado por 29 tablas relacionales activas auditadas en las migraciones:</w:t>
+        <w:t>El esquema de datos relacional de GesTock está conformado por 30 tablas relacionales activas auditadas en las migraciones:</w:t>
       </w:r>
     </w:p>
     <w:p>
@@ -11942,7 +11942,7 @@
           <w:sz w:val="20"/>
           <w:szCs w:val="20"/>
         </w:rPr>
-        <w:t>La confiabilidad de GesTock está respaldada por una batería automatizada en Jest con 286 pruebas ejecutadas con un 100% de éxito (275 de backend y 11 de contrato de la interfaz), complementadas con 92 verificaciones de extremo a extremo.</w:t>
+        <w:t>La confiabilidad de GesTock está respaldada por una batería automatizada en Jest con 298 pruebas ejecutadas con un 100% de éxito (287 de backend y 11 de contrato de la interfaz), complementadas con 92 verificaciones de extremo a extremo.</w:t>
       </w:r>
     </w:p>
     <w:tbl>
@@ -12962,7 +12962,7 @@
           <w:sz w:val="20"/>
           <w:szCs w:val="20"/>
         </w:rPr>
-        <w:t xml:space="preserve">Las 5 vistas de Kruchten articuladas con el modelo de datos relacional de 29 tablas.</w:t>
+        <w:t>Las 5 vistas de Kruchten articuladas con el modelo de datos relacional de 30 tablas.</w:t>
       </w:r>
     </w:p>
     <w:p>
@@ -13014,7 +13014,7 @@
           <w:sz w:val="20"/>
           <w:szCs w:val="20"/>
         </w:rPr>
-        <w:t>Desarrollo en TypeScript estricto, 286 pruebas automatizadas y arquitectura Cloud-Native con Docker Compose.</w:t>
+        <w:t>Desarrollo en TypeScript estricto, 298 pruebas automatizadas y arquitectura Cloud-Native con Docker Compose.</w:t>
       </w:r>
     </w:p>
     <w:sectPr>

</xml_diff>

<commit_message>
Actualizar la evidencia de documentación con el modelo de existencia por lote
</commit_message>
<xml_diff>
--- a/FASE 2/Evidencias Proyecto/Evidencias de documentación/Arquitectura Sistema.docx
+++ b/FASE 2/Evidencias Proyecto/Evidencias de documentación/Arquitectura Sistema.docx
@@ -6849,7 +6849,7 @@
           <w:sz w:val="20"/>
           <w:szCs w:val="20"/>
         </w:rPr>
-        <w:t>Validada mediante 298 pruebas automatizadas en Jest con 100% de éxito.</w:t>
+        <w:t>Validada mediante 303 pruebas automatizadas en Jest con 100% de éxito.</w:t>
       </w:r>
     </w:p>
     <w:p>
@@ -11942,7 +11942,7 @@
           <w:sz w:val="20"/>
           <w:szCs w:val="20"/>
         </w:rPr>
-        <w:t>La confiabilidad de GesTock está respaldada por una batería automatizada en Jest con 298 pruebas ejecutadas con un 100% de éxito (287 de backend y 11 de contrato de la interfaz), complementadas con 92 verificaciones de extremo a extremo.</w:t>
+        <w:t>La confiabilidad de GesTock está respaldada por una batería automatizada en Jest con 303 pruebas ejecutadas con un 100% de éxito (292 de backend y 11 de contrato de la interfaz), complementadas con 92 verificaciones de extremo a extremo.</w:t>
       </w:r>
     </w:p>
     <w:tbl>
@@ -13014,7 +13014,7 @@
           <w:sz w:val="20"/>
           <w:szCs w:val="20"/>
         </w:rPr>
-        <w:t>Desarrollo en TypeScript estricto, 298 pruebas automatizadas y arquitectura Cloud-Native con Docker Compose.</w:t>
+        <w:t>Desarrollo en TypeScript estricto, 303 pruebas automatizadas y arquitectura Cloud-Native con Docker Compose.</w:t>
       </w:r>
     </w:p>
     <w:sectPr>

</xml_diff>

<commit_message>
Actualizar la evidencia de documentación con la política de aserciones de latencia
</commit_message>
<xml_diff>
--- a/FASE 2/Evidencias Proyecto/Evidencias de documentación/Arquitectura Sistema.docx
+++ b/FASE 2/Evidencias Proyecto/Evidencias de documentación/Arquitectura Sistema.docx
@@ -6849,7 +6849,7 @@
           <w:sz w:val="20"/>
           <w:szCs w:val="20"/>
         </w:rPr>
-        <w:t>Validada mediante 303 pruebas automatizadas en Jest con 100% de éxito.</w:t>
+        <w:t>Validada mediante 308 pruebas automatizadas en Jest con 100% de éxito.</w:t>
       </w:r>
     </w:p>
     <w:p>
@@ -11942,7 +11942,7 @@
           <w:sz w:val="20"/>
           <w:szCs w:val="20"/>
         </w:rPr>
-        <w:t>La confiabilidad de GesTock está respaldada por una batería automatizada en Jest con 303 pruebas ejecutadas con un 100% de éxito (292 de backend y 11 de contrato de la interfaz), complementadas con 92 verificaciones de extremo a extremo.</w:t>
+        <w:t>La confiabilidad de GesTock está respaldada por una batería automatizada en Jest con 308 pruebas ejecutadas con un 100% de éxito (297 de backend y 11 de contrato de la interfaz), complementadas con 92 verificaciones de extremo a extremo.</w:t>
       </w:r>
     </w:p>
     <w:tbl>
@@ -13014,7 +13014,7 @@
           <w:sz w:val="20"/>
           <w:szCs w:val="20"/>
         </w:rPr>
-        <w:t>Desarrollo en TypeScript estricto, 303 pruebas automatizadas y arquitectura Cloud-Native con Docker Compose.</w:t>
+        <w:t>Desarrollo en TypeScript estricto, 308 pruebas automatizadas y arquitectura Cloud-Native con Docker Compose.</w:t>
       </w:r>
     </w:p>
     <w:sectPr>

</xml_diff>

<commit_message>
Incorporar el diagrama entidad-relación y actualizar la documentación técnica
</commit_message>
<xml_diff>
--- a/FASE 2/Evidencias Proyecto/Evidencias de documentación/Arquitectura Sistema.docx
+++ b/FASE 2/Evidencias Proyecto/Evidencias de documentación/Arquitectura Sistema.docx
@@ -6840,7 +6840,7 @@
           <w:sz w:val="20"/>
           <w:szCs w:val="20"/>
         </w:rPr>
-        <w:t>• RNF-MANT-02 (Cobertura de Pruebas &gt; 85% en la lógica de negocio): Medida con `npm run test:coverage:total`, que ejecuta las dos baterías sobre el código del servidor: 78,71% de las sentencias y 87,96% de las funciones en el total, y por encima del 85% en los módulos de reglas de negocio (tributario 91,8%, facturas 92,4%, reabastecimiento 87,8%, caja 85,6%). Los valores más bajos corresponden a la integración con el servicio externo de reconocimiento (45,7%) y a las rutas (71,4%), estas últimas ejercitadas además por las 109 comprobaciones de extremo a extremo. 308 pruebas automatizadas con 100% de éxito.</w:t>
+        <w:t>• RNF-MANT-02 (Cobertura de Pruebas &gt; 85% en la lógica de negocio): Medida con `npm run test:coverage:total`, que ejecuta las dos baterías sobre el código del servidor: 78,71% de las sentencias y 87,96% de las funciones en el total, y por encima del 85% en los módulos de reglas de negocio (tributario 91,8%, facturas 92,4%, reabastecimiento 87,8%, caja 85,6%). Los valores más bajos corresponden a la integración con el servicio externo de reconocimiento (45,7%) y a las rutas (71,4%), estas últimas ejercitadas además por las 109 comprobaciones de extremo a extremo. 297 pruebas automatizadas con 100% de éxito.</w:t>
       </w:r>
       <w:r>
         <w:rPr>
@@ -6865,7 +6865,7 @@
           <w:sz w:val="20"/>
           <w:szCs w:val="20"/>
         </w:rPr>
-        <w:t xml:space="preserve">• RNF-MANT-03 (Migraciones DDL 001-016): </w:t>
+        <w:t xml:space="preserve">• RNF-MANT-03 (Migraciones DDL 001-017): </w:t>
       </w:r>
       <w:r>
         <w:rPr>
@@ -7218,7 +7218,7 @@
           <w:sz w:val="20"/>
           <w:szCs w:val="20"/>
         </w:rPr>
-        <w:t>El esquema de datos relacional de GesTock está conformado por 30 tablas relacionales activas auditadas en las migraciones:</w:t>
+        <w:t>El esquema de datos relacional de GesTock está conformado por 29 tablas relacionales activas auditadas en las migraciones:</w:t>
       </w:r>
     </w:p>
     <w:p>
@@ -7365,7 +7365,7 @@
           <w:sz w:val="20"/>
           <w:szCs w:val="20"/>
         </w:rPr>
-        <w:t xml:space="preserve">• Inteligencia de Mercado y Versionado DDL (2): </w:t>
+        <w:t>• Existencia por Lote y Versionado DDL (2): lotes, _migrations (Control y trazabilidad de migraciones DDL ejecutadas).</w:t>
       </w:r>
       <w:r>
         <w:rPr>
@@ -7374,7 +7374,6 @@
           <w:sz w:val="20"/>
           <w:szCs w:val="20"/>
         </w:rPr>
-        <w:t xml:space="preserve">market_trends, _migrations (Control y trazabilidad de migraciones DDL ejecutadas).</w:t>
       </w:r>
     </w:p>
     <w:p>
@@ -7654,7 +7653,7 @@
           <w:sz w:val="28"/>
           <w:szCs w:val="28"/>
         </w:rPr>
-        <w:t>6. Catálogo de Endpoints y Matriz de Trazabilidad (72 Endpoints)</w:t>
+        <w:t>6. Catálogo de Endpoints y Matriz de Trazabilidad (69 Endpoints)</w:t>
       </w:r>
     </w:p>
     <w:p>
@@ -7668,7 +7667,7 @@
           <w:sz w:val="20"/>
           <w:szCs w:val="20"/>
         </w:rPr>
-        <w:t>A continuación se resumen los 72 endpoints RESTful del sistema, indicando su rol de acceso mínimo:</w:t>
+        <w:t>A continuación se resumen los 69 endpoints RESTful del sistema, indicando su rol de acceso mínimo:</w:t>
       </w:r>
     </w:p>
     <w:tbl>
@@ -11941,7 +11940,7 @@
           <w:sz w:val="20"/>
           <w:szCs w:val="20"/>
         </w:rPr>
-        <w:t>La confiabilidad de GesTock está respaldada por una batería automatizada en Jest con 308 pruebas ejecutadas con un 100% de éxito (297 de backend y 11 de contrato de la interfaz), complementadas con 92 verificaciones de extremo a extremo.</w:t>
+        <w:t>La confiabilidad de GesTock está respaldada por una batería automatizada en Jest con 297 pruebas ejecutadas con un 100% de éxito (286 de backend y 11 de contrato de la interfaz), complementadas con 92 verificaciones de extremo a extremo.</w:t>
       </w:r>
     </w:p>
     <w:tbl>
@@ -12961,7 +12960,7 @@
           <w:sz w:val="20"/>
           <w:szCs w:val="20"/>
         </w:rPr>
-        <w:t>Las 5 vistas de Kruchten articuladas con el modelo de datos relacional de 30 tablas.</w:t>
+        <w:t>Las 5 vistas de Kruchten articuladas con el modelo de datos relacional de 29 tablas.</w:t>
       </w:r>
     </w:p>
     <w:p>
@@ -13013,7 +13012,7 @@
           <w:sz w:val="20"/>
           <w:szCs w:val="20"/>
         </w:rPr>
-        <w:t>Desarrollo en TypeScript estricto, 308 pruebas automatizadas y arquitectura Cloud-Native con Docker Compose.</w:t>
+        <w:t>Desarrollo en TypeScript estricto, 297 pruebas automatizadas y arquitectura Cloud-Native con Docker Compose.</w:t>
       </w:r>
     </w:p>
     <w:sectPr>

</xml_diff>

<commit_message>
Incorporar a la evidencia el aviso programado de reposicion por correo
Codigo del transporte SMTP, del redactor del mensaje y del reloj de revision,
la bateria de dieciseis comprobaciones que lo fija, y la documentacion tecnica
con las cifras medidas de la fase.
</commit_message>
<xml_diff>
--- a/FASE 2/Evidencias Proyecto/Evidencias de documentación/Arquitectura Sistema.docx
+++ b/FASE 2/Evidencias Proyecto/Evidencias de documentación/Arquitectura Sistema.docx
@@ -6840,7 +6840,7 @@
           <w:sz w:val="20"/>
           <w:szCs w:val="20"/>
         </w:rPr>
-        <w:t>• RNF-MANT-02 (Cobertura de Pruebas &gt; 85% en la lógica de negocio): Medida con `npm run test:coverage:total`, que ejecuta las dos baterías sobre el código del servidor: 78,71% de las sentencias y 87,96% de las funciones en el total, y por encima del 85% en los módulos de reglas de negocio (tributario 91,8%, facturas 92,4%, reabastecimiento 87,8%, caja 85,6%). Los valores más bajos corresponden a la integración con el servicio externo de reconocimiento (45,7%) y a las rutas (71,4%), estas últimas ejercitadas además por las 117 comprobaciones de extremo a extremo. 312 pruebas automatizadas con 100% de éxito.</w:t>
+        <w:t>• RNF-MANT-02 (Cobertura de Pruebas &gt; 85% en la lógica de negocio): Medida con `npm run test:coverage:total`, que ejecuta las dos baterías sobre el código del servidor: 78,07% de las sentencias y 86,24% de las funciones en el total, y por encima del 85% en los módulos de reglas de negocio (tributario 91,8%, facturas 91,3%, reabastecimiento 87,8%, caja 85,6%). Los valores más bajos corresponden a la integración con el servicio externo de reconocimiento (45,7%) y a las rutas (71,1%), estas últimas ejercitadas además por las 117 comprobaciones de extremo a extremo. 328 pruebas automatizadas con 100% de éxito.</w:t>
       </w:r>
       <w:r>
         <w:rPr>
@@ -7637,6 +7637,43 @@
         <w:t xml:space="preserve">ROP = (V_d * L) + SS
 Donde V_d es la velocidad diaria de venta, L el lead time del proveedor y SS el stock de seguridad.
 GET /suggest es una función pura en memoria; POST /suggest es la que persiste.</w:t>
+      </w:r>
+    </w:p>
+    <w:p>
+      <w:pPr>
+        <w:pStyle w:val="Heading2"/>
+        <w:spacing w:after="100" w:before="220"/>
+      </w:pPr>
+      <w:r>
+        <w:rPr>
+          <w:rFonts w:ascii="Arial" w:cs="Arial" w:eastAsia="Arial" w:hAnsi="Arial"/>
+          <w:b/>
+          <w:bCs/>
+          <w:color w:val="0F172A"/>
+          <w:sz w:val="24"/>
+          <w:szCs w:val="24"/>
+        </w:rPr>
+        <w:t>5.5 Aviso Programado de Reposición (RF-47)</w:t>
+      </w:r>
+    </w:p>
+    <w:p>
+      <w:pPr>
+        <w:pBdr>
+          <w:left w:val="single" w:color="2563EB" w:sz="24"/>
+        </w:pBdr>
+        <w:spacing w:after="140" w:before="100" w:line="260"/>
+        <w:ind w:left="240" w:right="240"/>
+      </w:pPr>
+      <w:r>
+        <w:rPr>
+          <w:rFonts w:ascii="Arial" w:cs="Arial" w:eastAsia="Arial" w:hAnsi="Arial"/>
+          <w:b/>
+          <w:bCs/>
+          <w:color w:val="1E3A8A"/>
+          <w:sz w:val="20"/>
+          <w:szCs w:val="20"/>
+        </w:rPr>
+        <w:t>El despacho del aviso de reposición estaba simulado: el método registraba el envío en el log, devolvía éxito y marcaba las órdenes como enviadas en los dos motores, sin que ningún correo saliera. La versión implementada despacha por SMTP y fija tres reglas. Primera: sin credenciales configuradas o con el servidor de correo caído, el sistema lo declara y las órdenes no se marcan como enviadas. Segunda: el día (norma ISO 1-7) y la hora (HH:MM) los fija el local en Configuración, y ambos campos son opcionales en el POST, de modo que conservan el valor guardado si no vienen. Tercera: el reloj revisa cada minuto y despacha si la hora configurada ya pasó y ese día aún no se envió, porque el equipo de un minimarket se apaga de noche y exigir coincidencia al minuto dejaría al local sin aviso cada vez que abre más tarde. La marca del último envío se guarda en la base, no en memoria, para que un reinicio no provoque un segundo correo del mismo día.</w:t>
       </w:r>
     </w:p>
     <w:p>
@@ -11940,7 +11977,7 @@
           <w:sz w:val="20"/>
           <w:szCs w:val="20"/>
         </w:rPr>
-        <w:t>La confiabilidad de GesTock está respaldada por una batería automatizada en Jest con 312 pruebas ejecutadas con un 100% de éxito (301 de backend y 11 de contrato de la interfaz), complementadas con 92 verificaciones de extremo a extremo.</w:t>
+        <w:t>La confiabilidad de GesTock está respaldada por una batería automatizada en Jest con 328 pruebas ejecutadas con un 100% de éxito (317 de backend y 11 de contrato de la interfaz), complementadas con 117 verificaciones de extremo a extremo.</w:t>
       </w:r>
     </w:p>
     <w:tbl>
@@ -13012,7 +13049,7 @@
           <w:sz w:val="20"/>
           <w:szCs w:val="20"/>
         </w:rPr>
-        <w:t>Desarrollo en TypeScript estricto, 312 pruebas automatizadas y arquitectura Cloud-Native con Docker Compose.</w:t>
+        <w:t>Desarrollo en TypeScript estricto, 328 pruebas automatizadas y arquitectura Cloud-Native con Docker Compose.</w:t>
       </w:r>
     </w:p>
     <w:sectPr>

</xml_diff>